<commit_message>
feat: update benchmark results and enhance documentation for Turing machine simulator
</commit_message>
<xml_diff>
--- a/documentos/reporteProyecto.docx
+++ b/documentos/reporteProyecto.docx
@@ -83,40 +83,7 @@
           <w:szCs w:val="24"/>
           <w:lang w:val="es-GT"/>
         </w:rPr>
-        <w:t>A</w:t>
-      </w:r>
-      <w:r>
-        <w:rPr>
-          <w:rFonts w:ascii="Times New Roman" w:hAnsi="Times New Roman" w:cs="Times New Roman"/>
-          <w:i/>
-          <w:iCs/>
-          <w:sz w:val="24"/>
-          <w:szCs w:val="24"/>
-          <w:lang w:val="es-GT"/>
-        </w:rPr>
-        <w:t>nálisis</w:t>
-      </w:r>
-      <w:r>
-        <w:rPr>
-          <w:rFonts w:ascii="Times New Roman" w:hAnsi="Times New Roman" w:cs="Times New Roman"/>
-          <w:i/>
-          <w:iCs/>
-          <w:sz w:val="24"/>
-          <w:szCs w:val="24"/>
-          <w:lang w:val="es-GT"/>
-        </w:rPr>
-        <w:t xml:space="preserve"> y diseño</w:t>
-      </w:r>
-      <w:r>
-        <w:rPr>
-          <w:rFonts w:ascii="Times New Roman" w:hAnsi="Times New Roman" w:cs="Times New Roman"/>
-          <w:i/>
-          <w:iCs/>
-          <w:sz w:val="24"/>
-          <w:szCs w:val="24"/>
-          <w:lang w:val="es-GT"/>
-        </w:rPr>
-        <w:t xml:space="preserve"> de algoritmos</w:t>
+        <w:t>Análisis y diseño de algoritmos</w:t>
       </w:r>
     </w:p>
     <w:p>
@@ -174,6 +141,7 @@
       <w:r>
         <w:rPr>
           <w:rFonts w:ascii="Times New Roman" w:hAnsi="Times New Roman" w:cs="Times New Roman"/>
+          <w:noProof/>
           <w:sz w:val="24"/>
           <w:szCs w:val="24"/>
           <w:lang w:val="es-GT"/>
@@ -536,47 +504,16 @@
           <w:szCs w:val="24"/>
           <w:lang w:val="es-GT"/>
         </w:rPr>
-        <w:t xml:space="preserve">Tabla </w:t>
+        <w:t>Tabla 1.</w:t>
       </w:r>
       <w:r>
         <w:rPr>
           <w:rFonts w:ascii="Times New Roman" w:hAnsi="Times New Roman" w:cs="Times New Roman"/>
-          <w:b/>
-          <w:bCs/>
-          <w:sz w:val="24"/>
-          <w:szCs w:val="24"/>
-          <w:lang w:val="es-GT"/>
-        </w:rPr>
-        <w:t>1</w:t>
-      </w:r>
-      <w:r>
-        <w:rPr>
-          <w:rFonts w:ascii="Times New Roman" w:hAnsi="Times New Roman" w:cs="Times New Roman"/>
-          <w:b/>
-          <w:bCs/>
-          <w:sz w:val="24"/>
-          <w:szCs w:val="24"/>
-          <w:lang w:val="es-GT"/>
-        </w:rPr>
-        <w:t>.</w:t>
-      </w:r>
-      <w:r>
-        <w:rPr>
-          <w:rFonts w:ascii="Times New Roman" w:hAnsi="Times New Roman" w:cs="Times New Roman"/>
-          <w:sz w:val="24"/>
-          <w:szCs w:val="24"/>
-          <w:lang w:val="es-GT"/>
-        </w:rPr>
-        <w:t xml:space="preserve"> </w:t>
-      </w:r>
-      <w:r>
-        <w:rPr>
-          <w:rFonts w:ascii="Times New Roman" w:hAnsi="Times New Roman" w:cs="Times New Roman"/>
-          <w:sz w:val="24"/>
-          <w:szCs w:val="24"/>
-          <w:lang w:val="es-GT"/>
-        </w:rPr>
-        <w:t>Concepto vs. Convención</w:t>
+          <w:sz w:val="24"/>
+          <w:szCs w:val="24"/>
+          <w:lang w:val="es-GT"/>
+        </w:rPr>
+        <w:t xml:space="preserve"> Concepto vs. Convención</w:t>
       </w:r>
     </w:p>
     <w:tbl>
@@ -691,20 +628,9 @@
                 <w:szCs w:val="24"/>
                 <w:lang w:val="es-GT"/>
               </w:rPr>
-              <w:t>Cadena de n unos: 1^</w:t>
-            </w:r>
-            <w:proofErr w:type="gramStart"/>
-            <w:r>
-              <w:rPr>
-                <w:rFonts w:ascii="Times New Roman" w:hAnsi="Times New Roman" w:cs="Times New Roman"/>
-                <w:sz w:val="24"/>
-                <w:szCs w:val="24"/>
-                <w:lang w:val="es-GT"/>
-              </w:rPr>
-              <w:t>n  (</w:t>
+              <w:t>Cadena de n unos: 1^n  (</w:t>
             </w:r>
             <w:proofErr w:type="spellStart"/>
-            <w:proofErr w:type="gramEnd"/>
             <w:r>
               <w:rPr>
                 <w:rFonts w:ascii="Times New Roman" w:hAnsi="Times New Roman" w:cs="Times New Roman"/>
@@ -849,27 +775,7 @@
                 <w:szCs w:val="24"/>
                 <w:lang w:val="es-GT"/>
               </w:rPr>
-              <w:t xml:space="preserve"> (sin unos) -- </w:t>
-            </w:r>
-            <w:proofErr w:type="gramStart"/>
-            <w:r>
-              <w:rPr>
-                <w:rFonts w:ascii="Times New Roman" w:hAnsi="Times New Roman" w:cs="Times New Roman"/>
-                <w:sz w:val="24"/>
-                <w:szCs w:val="24"/>
-                <w:lang w:val="es-GT"/>
-              </w:rPr>
-              <w:t>F(</w:t>
-            </w:r>
-            <w:proofErr w:type="gramEnd"/>
-            <w:r>
-              <w:rPr>
-                <w:rFonts w:ascii="Times New Roman" w:hAnsi="Times New Roman" w:cs="Times New Roman"/>
-                <w:sz w:val="24"/>
-                <w:szCs w:val="24"/>
-                <w:lang w:val="es-GT"/>
-              </w:rPr>
-              <w:t>0) = 0</w:t>
+              <w:t xml:space="preserve"> (sin unos) -- F(0) = 0</w:t>
             </w:r>
           </w:p>
         </w:tc>
@@ -1026,27 +932,7 @@
           <w:szCs w:val="24"/>
           <w:lang w:val="es-GT"/>
         </w:rPr>
-        <w:t xml:space="preserve">Ejemplo: para n = 5, la entrada es "11111" y la salida esperada es "11111" (cinco unos, ya que </w:t>
-      </w:r>
-      <w:proofErr w:type="gramStart"/>
-      <w:r>
-        <w:rPr>
-          <w:rFonts w:ascii="Times New Roman" w:hAnsi="Times New Roman" w:cs="Times New Roman"/>
-          <w:sz w:val="24"/>
-          <w:szCs w:val="24"/>
-          <w:lang w:val="es-GT"/>
-        </w:rPr>
-        <w:t>F(</w:t>
-      </w:r>
-      <w:proofErr w:type="gramEnd"/>
-      <w:r>
-        <w:rPr>
-          <w:rFonts w:ascii="Times New Roman" w:hAnsi="Times New Roman" w:cs="Times New Roman"/>
-          <w:sz w:val="24"/>
-          <w:szCs w:val="24"/>
-          <w:lang w:val="es-GT"/>
-        </w:rPr>
-        <w:t>5) = 5).</w:t>
+        <w:t>Ejemplo: para n = 5, la entrada es "11111" y la salida esperada es "11111" (cinco unos, ya que F(5) = 5).</w:t>
       </w:r>
     </w:p>
     <w:p>
@@ -1066,25 +952,7 @@
           <w:szCs w:val="24"/>
           <w:lang w:val="es-GT"/>
         </w:rPr>
-        <w:t>1.</w:t>
-      </w:r>
-      <w:r>
-        <w:rPr>
-          <w:rFonts w:ascii="Times New Roman" w:hAnsi="Times New Roman" w:cs="Times New Roman"/>
-          <w:sz w:val="24"/>
-          <w:szCs w:val="24"/>
-          <w:lang w:val="es-GT"/>
-        </w:rPr>
-        <w:t>1</w:t>
-      </w:r>
-      <w:r>
-        <w:rPr>
-          <w:rFonts w:ascii="Times New Roman" w:hAnsi="Times New Roman" w:cs="Times New Roman"/>
-          <w:sz w:val="24"/>
-          <w:szCs w:val="24"/>
-          <w:lang w:val="es-GT"/>
-        </w:rPr>
-        <w:t xml:space="preserve"> Convención de entrada</w:t>
+        <w:t>1.1 Convención de entrada</w:t>
       </w:r>
     </w:p>
     <w:p>
@@ -2291,27 +2159,7 @@
           <w:szCs w:val="24"/>
           <w:lang w:val="es-GT"/>
         </w:rPr>
-        <w:t>Caso cero (</w:t>
-      </w:r>
-      <w:proofErr w:type="gramStart"/>
-      <w:r>
-        <w:rPr>
-          <w:rFonts w:ascii="Times New Roman" w:hAnsi="Times New Roman" w:cs="Times New Roman"/>
-          <w:sz w:val="24"/>
-          <w:szCs w:val="24"/>
-          <w:lang w:val="es-GT"/>
-        </w:rPr>
-        <w:t>F(</w:t>
-      </w:r>
-      <w:proofErr w:type="gramEnd"/>
-      <w:r>
-        <w:rPr>
-          <w:rFonts w:ascii="Times New Roman" w:hAnsi="Times New Roman" w:cs="Times New Roman"/>
-          <w:sz w:val="24"/>
-          <w:szCs w:val="24"/>
-          <w:lang w:val="es-GT"/>
-        </w:rPr>
-        <w:t>0) = 0): la cinta queda completamente en blanco (sin unos).</w:t>
+        <w:t>Caso cero (F(0) = 0): la cinta queda completamente en blanco (sin unos).</w:t>
       </w:r>
     </w:p>
     <w:p>
@@ -3494,25 +3342,7 @@
           <w:szCs w:val="24"/>
           <w:lang w:val="es-GT"/>
         </w:rPr>
-        <w:t>Se utiliza el símbolo - como prefijo en la cinta para indicar signo negativo.</w:t>
-      </w:r>
-      <w:r>
-        <w:rPr>
-          <w:rFonts w:ascii="Times New Roman" w:hAnsi="Times New Roman" w:cs="Times New Roman"/>
-          <w:sz w:val="24"/>
-          <w:szCs w:val="24"/>
-          <w:lang w:val="es-GT"/>
-        </w:rPr>
-        <w:t xml:space="preserve"> </w:t>
-      </w:r>
-      <w:r>
-        <w:rPr>
-          <w:rFonts w:ascii="Times New Roman" w:hAnsi="Times New Roman" w:cs="Times New Roman"/>
-          <w:sz w:val="24"/>
-          <w:szCs w:val="24"/>
-          <w:lang w:val="es-GT"/>
-        </w:rPr>
-        <w:t xml:space="preserve">Ejemplo: -111 representa </w:t>
+        <w:t xml:space="preserve">Se utiliza el símbolo - como prefijo en la cinta para indicar signo negativo. Ejemplo: -111 representa </w:t>
       </w:r>
       <m:oMath>
         <m:r>
@@ -3569,25 +3399,7 @@
           <w:szCs w:val="24"/>
           <w:lang w:val="es-GT"/>
         </w:rPr>
-        <w:t>Comportamiento de la MT: al leer - como primer símbolo, la máquina no encuentra transición definida desde el estado inicial (q0 solo tiene transiciones para 1 y B), por lo que</w:t>
-      </w:r>
-      <w:r>
-        <w:rPr>
-          <w:rFonts w:ascii="Times New Roman" w:hAnsi="Times New Roman" w:cs="Times New Roman"/>
-          <w:sz w:val="24"/>
-          <w:szCs w:val="24"/>
-          <w:lang w:val="es-GT"/>
-        </w:rPr>
-        <w:t xml:space="preserve"> </w:t>
-      </w:r>
-      <w:r>
-        <w:rPr>
-          <w:rFonts w:ascii="Times New Roman" w:hAnsi="Times New Roman" w:cs="Times New Roman"/>
-          <w:sz w:val="24"/>
-          <w:szCs w:val="24"/>
-          <w:lang w:val="es-GT"/>
-        </w:rPr>
-        <w:t>se detiene sin aceptar.</w:t>
+        <w:t>Comportamiento de la MT: al leer - como primer símbolo, la máquina no encuentra transición definida desde el estado inicial (q0 solo tiene transiciones para 1 y B), por lo que se detiene sin aceptar.</w:t>
       </w:r>
     </w:p>
     <w:p>
@@ -3697,25 +3509,7 @@
           <w:szCs w:val="24"/>
           <w:lang w:val="es-GT"/>
         </w:rPr>
-        <w:t>no se calcula con</w:t>
-      </w:r>
-      <w:r>
-        <w:rPr>
-          <w:rFonts w:ascii="Times New Roman" w:hAnsi="Times New Roman" w:cs="Times New Roman"/>
-          <w:sz w:val="24"/>
-          <w:szCs w:val="24"/>
-          <w:lang w:val="es-GT"/>
-        </w:rPr>
-        <w:t xml:space="preserve"> </w:t>
-      </w:r>
-      <w:r>
-        <w:rPr>
-          <w:rFonts w:ascii="Times New Roman" w:hAnsi="Times New Roman" w:cs="Times New Roman"/>
-          <w:sz w:val="24"/>
-          <w:szCs w:val="24"/>
-          <w:lang w:val="es-GT"/>
-        </w:rPr>
-        <w:t>esta MT de Fibonacci unaria.</w:t>
+        <w:t>no se calcula con esta MT de Fibonacci unaria.</w:t>
       </w:r>
     </w:p>
     <w:p>
@@ -3739,25 +3533,7 @@
           <w:szCs w:val="24"/>
           <w:lang w:val="es-GT"/>
         </w:rPr>
-        <w:t>El simulador reporta:</w:t>
-      </w:r>
-      <w:r>
-        <w:rPr>
-          <w:rFonts w:ascii="Times New Roman" w:hAnsi="Times New Roman" w:cs="Times New Roman"/>
-          <w:sz w:val="24"/>
-          <w:szCs w:val="24"/>
-          <w:lang w:val="es-GT"/>
-        </w:rPr>
-        <w:t xml:space="preserve"> </w:t>
-      </w:r>
-      <w:r>
-        <w:rPr>
-          <w:rFonts w:ascii="Times New Roman" w:hAnsi="Times New Roman" w:cs="Times New Roman"/>
-          <w:sz w:val="24"/>
-          <w:szCs w:val="24"/>
-          <w:lang w:val="es-GT"/>
-        </w:rPr>
-        <w:t>"Detenida: no hay transición aplicable" para entradas negativas.</w:t>
+        <w:t>El simulador reporta: "Detenida: no hay transición aplicable" para entradas negativas.</w:t>
       </w:r>
     </w:p>
     <w:p>
@@ -4070,16 +3846,7 @@
           <w:szCs w:val="24"/>
           <w:lang w:val="es-GT"/>
         </w:rPr>
-        <w:t xml:space="preserve">2.1 </w:t>
-      </w:r>
-      <w:r>
-        <w:rPr>
-          <w:rFonts w:ascii="Times New Roman" w:hAnsi="Times New Roman" w:cs="Times New Roman"/>
-          <w:sz w:val="24"/>
-          <w:szCs w:val="24"/>
-          <w:lang w:val="es-GT"/>
-        </w:rPr>
-        <w:t>Descripción general de la estructura</w:t>
+        <w:t>2.1 Descripción general de la estructura</w:t>
       </w:r>
     </w:p>
     <w:p>
@@ -4098,61 +3865,7 @@
           <w:szCs w:val="24"/>
           <w:lang w:val="es-GT"/>
         </w:rPr>
-        <w:t>La Máquina de Turing diseñada para calcular Fibonacci (hasta n = 12) posee:</w:t>
-      </w:r>
-      <w:r>
-        <w:rPr>
-          <w:rFonts w:ascii="Times New Roman" w:hAnsi="Times New Roman" w:cs="Times New Roman"/>
-          <w:sz w:val="24"/>
-          <w:szCs w:val="24"/>
-          <w:lang w:val="es-GT"/>
-        </w:rPr>
-        <w:t xml:space="preserve"> </w:t>
-      </w:r>
-      <w:r>
-        <w:rPr>
-          <w:rFonts w:ascii="Times New Roman" w:hAnsi="Times New Roman" w:cs="Times New Roman"/>
-          <w:sz w:val="24"/>
-          <w:szCs w:val="24"/>
-          <w:lang w:val="es-GT"/>
-        </w:rPr>
-        <w:t>389 estados</w:t>
-      </w:r>
-      <w:r>
-        <w:rPr>
-          <w:rFonts w:ascii="Times New Roman" w:hAnsi="Times New Roman" w:cs="Times New Roman"/>
-          <w:sz w:val="24"/>
-          <w:szCs w:val="24"/>
-          <w:lang w:val="es-GT"/>
-        </w:rPr>
-        <w:t xml:space="preserve"> y </w:t>
-      </w:r>
-      <w:r>
-        <w:rPr>
-          <w:rFonts w:ascii="Times New Roman" w:hAnsi="Times New Roman" w:cs="Times New Roman"/>
-          <w:sz w:val="24"/>
-          <w:szCs w:val="24"/>
-          <w:lang w:val="es-GT"/>
-        </w:rPr>
-        <w:t>402 transiciones</w:t>
-      </w:r>
-      <w:r>
-        <w:rPr>
-          <w:rFonts w:ascii="Times New Roman" w:hAnsi="Times New Roman" w:cs="Times New Roman"/>
-          <w:sz w:val="24"/>
-          <w:szCs w:val="24"/>
-          <w:lang w:val="es-GT"/>
-        </w:rPr>
-        <w:t xml:space="preserve">. </w:t>
-      </w:r>
-      <w:r>
-        <w:rPr>
-          <w:rFonts w:ascii="Times New Roman" w:hAnsi="Times New Roman" w:cs="Times New Roman"/>
-          <w:sz w:val="24"/>
-          <w:szCs w:val="24"/>
-          <w:lang w:val="es-GT"/>
-        </w:rPr>
-        <w:t>Su funcionamiento se divide en tres fases principales:</w:t>
+        <w:t>La Máquina de Turing diseñada para calcular Fibonacci (hasta n = 12) posee: 389 estados y 402 transiciones. Su funcionamiento se divide en tres fases principales:</w:t>
       </w:r>
     </w:p>
     <w:p>
@@ -4203,7 +3916,6 @@
         <w:t xml:space="preserve">En esta fase la máquina cuenta cuántos símbolos 1 hay en la </w:t>
       </w:r>
       <w:proofErr w:type="spellStart"/>
-      <w:proofErr w:type="gramStart"/>
       <w:r>
         <w:rPr>
           <w:rFonts w:ascii="Times New Roman" w:hAnsi="Times New Roman" w:cs="Times New Roman"/>
@@ -4214,7 +3926,6 @@
         <w:t>entrada.Cada</w:t>
       </w:r>
       <w:proofErr w:type="spellEnd"/>
-      <w:proofErr w:type="gramEnd"/>
       <w:r>
         <w:rPr>
           <w:rFonts w:ascii="Times New Roman" w:hAnsi="Times New Roman" w:cs="Times New Roman"/>
@@ -4426,43 +4137,7 @@
           <w:szCs w:val="24"/>
           <w:lang w:val="es-GT"/>
         </w:rPr>
-        <w:t>, significa que terminó de contar la entrada.</w:t>
-      </w:r>
-      <w:r>
-        <w:rPr>
-          <w:rFonts w:ascii="Times New Roman" w:hAnsi="Times New Roman" w:cs="Times New Roman"/>
-          <w:sz w:val="24"/>
-          <w:szCs w:val="24"/>
-          <w:lang w:val="es-GT"/>
-        </w:rPr>
-        <w:t xml:space="preserve"> </w:t>
-      </w:r>
-      <w:r>
-        <w:rPr>
-          <w:rFonts w:ascii="Times New Roman" w:hAnsi="Times New Roman" w:cs="Times New Roman"/>
-          <w:sz w:val="24"/>
-          <w:szCs w:val="24"/>
-          <w:lang w:val="es-GT"/>
-        </w:rPr>
-        <w:t>En ese momento:</w:t>
-      </w:r>
-      <w:r>
-        <w:rPr>
-          <w:rFonts w:ascii="Times New Roman" w:hAnsi="Times New Roman" w:cs="Times New Roman"/>
-          <w:sz w:val="24"/>
-          <w:szCs w:val="24"/>
-          <w:lang w:val="es-GT"/>
-        </w:rPr>
-        <w:t xml:space="preserve"> </w:t>
-      </w:r>
-      <w:r>
-        <w:rPr>
-          <w:rFonts w:ascii="Times New Roman" w:hAnsi="Times New Roman" w:cs="Times New Roman"/>
-          <w:sz w:val="24"/>
-          <w:szCs w:val="24"/>
-          <w:lang w:val="es-GT"/>
-        </w:rPr>
-        <w:t xml:space="preserve">Entra a una cadena de estados </w:t>
+        <w:t xml:space="preserve">, significa que terminó de contar la entrada. En ese momento: Entra a una cadena de estados </w:t>
       </w:r>
       <w:proofErr w:type="spellStart"/>
       <w:r>
@@ -4482,34 +4157,7 @@
           <w:szCs w:val="24"/>
           <w:lang w:val="es-GT"/>
         </w:rPr>
-        <w:t>, c</w:t>
-      </w:r>
-      <w:r>
-        <w:rPr>
-          <w:rFonts w:ascii="Times New Roman" w:hAnsi="Times New Roman" w:cs="Times New Roman"/>
-          <w:sz w:val="24"/>
-          <w:szCs w:val="24"/>
-          <w:lang w:val="es-GT"/>
-        </w:rPr>
-        <w:t>ada estado escribe un 1</w:t>
-      </w:r>
-      <w:r>
-        <w:rPr>
-          <w:rFonts w:ascii="Times New Roman" w:hAnsi="Times New Roman" w:cs="Times New Roman"/>
-          <w:sz w:val="24"/>
-          <w:szCs w:val="24"/>
-          <w:lang w:val="es-GT"/>
-        </w:rPr>
-        <w:t>, s</w:t>
-      </w:r>
-      <w:r>
-        <w:rPr>
-          <w:rFonts w:ascii="Times New Roman" w:hAnsi="Times New Roman" w:cs="Times New Roman"/>
-          <w:sz w:val="24"/>
-          <w:szCs w:val="24"/>
-          <w:lang w:val="es-GT"/>
-        </w:rPr>
-        <w:t>e generan exactamente F(i) unos consecutivos</w:t>
+        <w:t>, cada estado escribe un 1, se generan exactamente F(i) unos consecutivos</w:t>
       </w:r>
     </w:p>
     <w:p>
@@ -4691,27 +4339,7 @@
           <w:lang w:val="es-GT"/>
         </w:rPr>
         <w:br/>
-        <w:t>(</w:t>
-      </w:r>
-      <w:proofErr w:type="gramStart"/>
-      <w:r>
-        <w:rPr>
-          <w:rFonts w:ascii="Times New Roman" w:hAnsi="Times New Roman" w:cs="Times New Roman"/>
-          <w:sz w:val="24"/>
-          <w:szCs w:val="24"/>
-          <w:lang w:val="es-GT"/>
-        </w:rPr>
-        <w:t>F(</w:t>
-      </w:r>
-      <w:proofErr w:type="gramEnd"/>
-      <w:r>
-        <w:rPr>
-          <w:rFonts w:ascii="Times New Roman" w:hAnsi="Times New Roman" w:cs="Times New Roman"/>
-          <w:sz w:val="24"/>
-          <w:szCs w:val="24"/>
-          <w:lang w:val="es-GT"/>
-        </w:rPr>
-        <w:t>0) = 0, no se escribe nada)</w:t>
+        <w:t>(F(0) = 0, no se escribe nada)</w:t>
       </w:r>
     </w:p>
     <w:p>
@@ -4765,27 +4393,7 @@
           <w:lang w:val="es-GT"/>
         </w:rPr>
         <w:br/>
-        <w:t>(</w:t>
-      </w:r>
-      <w:proofErr w:type="gramStart"/>
-      <w:r>
-        <w:rPr>
-          <w:rFonts w:ascii="Times New Roman" w:hAnsi="Times New Roman" w:cs="Times New Roman"/>
-          <w:sz w:val="24"/>
-          <w:szCs w:val="24"/>
-          <w:lang w:val="es-GT"/>
-        </w:rPr>
-        <w:t>F(</w:t>
-      </w:r>
-      <w:proofErr w:type="gramEnd"/>
-      <w:r>
-        <w:rPr>
-          <w:rFonts w:ascii="Times New Roman" w:hAnsi="Times New Roman" w:cs="Times New Roman"/>
-          <w:sz w:val="24"/>
-          <w:szCs w:val="24"/>
-          <w:lang w:val="es-GT"/>
-        </w:rPr>
-        <w:t>1) = 1)</w:t>
+        <w:t>(F(1) = 1)</w:t>
       </w:r>
     </w:p>
     <w:p>
@@ -4839,27 +4447,7 @@
           <w:lang w:val="es-GT"/>
         </w:rPr>
         <w:br/>
-        <w:t>(</w:t>
-      </w:r>
-      <w:proofErr w:type="gramStart"/>
-      <w:r>
-        <w:rPr>
-          <w:rFonts w:ascii="Times New Roman" w:hAnsi="Times New Roman" w:cs="Times New Roman"/>
-          <w:sz w:val="24"/>
-          <w:szCs w:val="24"/>
-          <w:lang w:val="es-GT"/>
-        </w:rPr>
-        <w:t>F(</w:t>
-      </w:r>
-      <w:proofErr w:type="gramEnd"/>
-      <w:r>
-        <w:rPr>
-          <w:rFonts w:ascii="Times New Roman" w:hAnsi="Times New Roman" w:cs="Times New Roman"/>
-          <w:sz w:val="24"/>
-          <w:szCs w:val="24"/>
-          <w:lang w:val="es-GT"/>
-        </w:rPr>
-        <w:t>2) = 1)</w:t>
+        <w:t>(F(2) = 1)</w:t>
       </w:r>
     </w:p>
     <w:p>
@@ -5010,24 +4598,7 @@
           <w:lang w:val="es-GT"/>
         </w:rPr>
         <w:br/>
-      </w:r>
-      <w:r>
-        <w:rPr>
-          <w:rFonts w:ascii="Times New Roman" w:hAnsi="Times New Roman" w:cs="Times New Roman"/>
-          <w:sz w:val="24"/>
-          <w:szCs w:val="24"/>
-          <w:lang w:val="es-GT"/>
-        </w:rPr>
-        <w:t>Solo se va a</w:t>
-      </w:r>
-      <w:r>
-        <w:rPr>
-          <w:rFonts w:ascii="Times New Roman" w:hAnsi="Times New Roman" w:cs="Times New Roman"/>
-          <w:sz w:val="24"/>
-          <w:szCs w:val="24"/>
-          <w:lang w:val="es-GT"/>
-        </w:rPr>
-        <w:t xml:space="preserve"> presenta un extracto representativo organizado por fases.</w:t>
+        <w:t>Solo se va a presenta un extracto representativo organizado por fases.</w:t>
       </w:r>
     </w:p>
     <w:p>
@@ -5073,18 +4644,7 @@
           <w:szCs w:val="24"/>
           <w:lang w:val="es-GT"/>
         </w:rPr>
-        <w:t xml:space="preserve">Tabla </w:t>
-      </w:r>
-      <w:r>
-        <w:rPr>
-          <w:rFonts w:ascii="Times New Roman" w:hAnsi="Times New Roman" w:cs="Times New Roman"/>
-          <w:b/>
-          <w:bCs/>
-          <w:sz w:val="24"/>
-          <w:szCs w:val="24"/>
-          <w:lang w:val="es-GT"/>
-        </w:rPr>
-        <w:t>5</w:t>
+        <w:t>Tabla 5</w:t>
       </w:r>
       <w:r>
         <w:rPr>
@@ -7670,27 +7230,7 @@
           <w:szCs w:val="24"/>
           <w:lang w:val="es-GT"/>
         </w:rPr>
-        <w:t xml:space="preserve"> Fase de escritura (ejemplo: n = 3, </w:t>
-      </w:r>
-      <w:proofErr w:type="gramStart"/>
-      <w:r>
-        <w:rPr>
-          <w:rFonts w:ascii="Times New Roman" w:hAnsi="Times New Roman" w:cs="Times New Roman"/>
-          <w:sz w:val="24"/>
-          <w:szCs w:val="24"/>
-          <w:lang w:val="es-GT"/>
-        </w:rPr>
-        <w:t>F(</w:t>
-      </w:r>
-      <w:proofErr w:type="gramEnd"/>
-      <w:r>
-        <w:rPr>
-          <w:rFonts w:ascii="Times New Roman" w:hAnsi="Times New Roman" w:cs="Times New Roman"/>
-          <w:sz w:val="24"/>
-          <w:szCs w:val="24"/>
-          <w:lang w:val="es-GT"/>
-        </w:rPr>
-        <w:t>3) = 2)</w:t>
+        <w:t xml:space="preserve"> Fase de escritura (ejemplo: n = 3, F(3) = 2)</w:t>
       </w:r>
     </w:p>
     <w:p>
@@ -8205,27 +7745,7 @@
           <w:szCs w:val="24"/>
           <w:lang w:val="es-GT"/>
         </w:rPr>
-        <w:t xml:space="preserve">Fase de escritura (ejemplo: n = 5, </w:t>
-      </w:r>
-      <w:proofErr w:type="gramStart"/>
-      <w:r>
-        <w:rPr>
-          <w:rFonts w:ascii="Times New Roman" w:hAnsi="Times New Roman" w:cs="Times New Roman"/>
-          <w:sz w:val="24"/>
-          <w:szCs w:val="24"/>
-          <w:lang w:val="es-GT"/>
-        </w:rPr>
-        <w:t>F(</w:t>
-      </w:r>
-      <w:proofErr w:type="gramEnd"/>
-      <w:r>
-        <w:rPr>
-          <w:rFonts w:ascii="Times New Roman" w:hAnsi="Times New Roman" w:cs="Times New Roman"/>
-          <w:sz w:val="24"/>
-          <w:szCs w:val="24"/>
-          <w:lang w:val="es-GT"/>
-        </w:rPr>
-        <w:t>5) = 5)</w:t>
+        <w:t>Fase de escritura (ejemplo: n = 5, F(5) = 5)</w:t>
       </w:r>
     </w:p>
     <w:p>
@@ -10585,25 +10105,7 @@
                 <w:sz w:val="24"/>
                 <w:szCs w:val="24"/>
               </w:rPr>
-              <w:t xml:space="preserve">Caso base: </w:t>
-            </w:r>
-            <w:proofErr w:type="gramStart"/>
-            <w:r>
-              <w:rPr>
-                <w:rFonts w:ascii="Times New Roman" w:hAnsi="Times New Roman" w:cs="Times New Roman"/>
-                <w:sz w:val="24"/>
-                <w:szCs w:val="24"/>
-              </w:rPr>
-              <w:t>F(</w:t>
-            </w:r>
-            <w:proofErr w:type="gramEnd"/>
-            <w:r>
-              <w:rPr>
-                <w:rFonts w:ascii="Times New Roman" w:hAnsi="Times New Roman" w:cs="Times New Roman"/>
-                <w:sz w:val="24"/>
-                <w:szCs w:val="24"/>
-              </w:rPr>
-              <w:t>0) = 0</w:t>
+              <w:t>Caso base: F(0) = 0</w:t>
             </w:r>
           </w:p>
         </w:tc>
@@ -10723,25 +10225,7 @@
                 <w:sz w:val="24"/>
                 <w:szCs w:val="24"/>
               </w:rPr>
-              <w:t xml:space="preserve">Caso base: </w:t>
-            </w:r>
-            <w:proofErr w:type="gramStart"/>
-            <w:r>
-              <w:rPr>
-                <w:rFonts w:ascii="Times New Roman" w:hAnsi="Times New Roman" w:cs="Times New Roman"/>
-                <w:sz w:val="24"/>
-                <w:szCs w:val="24"/>
-              </w:rPr>
-              <w:t>F(</w:t>
-            </w:r>
-            <w:proofErr w:type="gramEnd"/>
-            <w:r>
-              <w:rPr>
-                <w:rFonts w:ascii="Times New Roman" w:hAnsi="Times New Roman" w:cs="Times New Roman"/>
-                <w:sz w:val="24"/>
-                <w:szCs w:val="24"/>
-              </w:rPr>
-              <w:t>1) = 1</w:t>
+              <w:t>Caso base: F(1) = 1</w:t>
             </w:r>
           </w:p>
         </w:tc>
@@ -10856,23 +10340,13 @@
                 <w:szCs w:val="24"/>
               </w:rPr>
             </w:pPr>
-            <w:proofErr w:type="gramStart"/>
-            <w:r>
-              <w:rPr>
-                <w:rFonts w:ascii="Times New Roman" w:hAnsi="Times New Roman" w:cs="Times New Roman"/>
-                <w:sz w:val="24"/>
-                <w:szCs w:val="24"/>
-              </w:rPr>
-              <w:t>F(</w:t>
-            </w:r>
-            <w:proofErr w:type="gramEnd"/>
-            <w:r>
-              <w:rPr>
-                <w:rFonts w:ascii="Times New Roman" w:hAnsi="Times New Roman" w:cs="Times New Roman"/>
-                <w:sz w:val="24"/>
-                <w:szCs w:val="24"/>
-              </w:rPr>
-              <w:t>5) = 5, salida = cinco unos</w:t>
+            <w:r>
+              <w:rPr>
+                <w:rFonts w:ascii="Times New Roman" w:hAnsi="Times New Roman" w:cs="Times New Roman"/>
+                <w:sz w:val="24"/>
+                <w:szCs w:val="24"/>
+              </w:rPr>
+              <w:t>F(5) = 5, salida = cinco unos</w:t>
             </w:r>
           </w:p>
         </w:tc>
@@ -10986,23 +10460,13 @@
                 <w:szCs w:val="24"/>
               </w:rPr>
             </w:pPr>
-            <w:proofErr w:type="gramStart"/>
-            <w:r>
-              <w:rPr>
-                <w:rFonts w:ascii="Times New Roman" w:hAnsi="Times New Roman" w:cs="Times New Roman"/>
-                <w:sz w:val="24"/>
-                <w:szCs w:val="24"/>
-              </w:rPr>
-              <w:t>F(</w:t>
-            </w:r>
-            <w:proofErr w:type="gramEnd"/>
-            <w:r>
-              <w:rPr>
-                <w:rFonts w:ascii="Times New Roman" w:hAnsi="Times New Roman" w:cs="Times New Roman"/>
-                <w:sz w:val="24"/>
-                <w:szCs w:val="24"/>
-              </w:rPr>
-              <w:t>7) = 13, salida = trece unos</w:t>
+            <w:r>
+              <w:rPr>
+                <w:rFonts w:ascii="Times New Roman" w:hAnsi="Times New Roman" w:cs="Times New Roman"/>
+                <w:sz w:val="24"/>
+                <w:szCs w:val="24"/>
+              </w:rPr>
+              <w:t>F(7) = 13, salida = trece unos</w:t>
             </w:r>
           </w:p>
         </w:tc>
@@ -11117,23 +10581,13 @@
                 <w:szCs w:val="24"/>
               </w:rPr>
             </w:pPr>
-            <w:proofErr w:type="gramStart"/>
-            <w:r>
-              <w:rPr>
-                <w:rFonts w:ascii="Times New Roman" w:hAnsi="Times New Roman" w:cs="Times New Roman"/>
-                <w:sz w:val="24"/>
-                <w:szCs w:val="24"/>
-              </w:rPr>
-              <w:t>F(</w:t>
-            </w:r>
-            <w:proofErr w:type="gramEnd"/>
-            <w:r>
-              <w:rPr>
-                <w:rFonts w:ascii="Times New Roman" w:hAnsi="Times New Roman" w:cs="Times New Roman"/>
-                <w:sz w:val="24"/>
-                <w:szCs w:val="24"/>
-              </w:rPr>
-              <w:t>12) = 144, salida = 144 unos</w:t>
+            <w:r>
+              <w:rPr>
+                <w:rFonts w:ascii="Times New Roman" w:hAnsi="Times New Roman" w:cs="Times New Roman"/>
+                <w:sz w:val="24"/>
+                <w:szCs w:val="24"/>
+              </w:rPr>
+              <w:t>F(12) = 144, salida = 144 unos</w:t>
             </w:r>
           </w:p>
         </w:tc>
@@ -11270,11 +10724,572 @@
           <w:lang w:val="es-GT"/>
         </w:rPr>
       </w:pPr>
+    </w:p>
+    <w:p>
+      <w:pPr>
+        <w:pStyle w:val="Heading2"/>
+        <w:rPr>
+          <w:rFonts w:ascii="Times New Roman" w:hAnsi="Times New Roman" w:cs="Times New Roman"/>
+          <w:lang w:val="es-GT"/>
+        </w:rPr>
+      </w:pPr>
       <w:r>
         <w:rPr>
           <w:rFonts w:ascii="Times New Roman" w:hAnsi="Times New Roman" w:cs="Times New Roman"/>
-          <w:sz w:val="24"/>
-          <w:szCs w:val="24"/>
+          <w:lang w:val="es-GT"/>
+        </w:rPr>
+        <w:t>3.2 Programa En Python</w:t>
+      </w:r>
+    </w:p>
+    <w:p>
+      <w:pPr>
+        <w:pStyle w:val="Heading2"/>
+        <w:rPr>
+          <w:rFonts w:ascii="Times New Roman" w:hAnsi="Times New Roman" w:cs="Times New Roman"/>
+          <w:lang w:val="es-GT"/>
+        </w:rPr>
+      </w:pPr>
+      <w:r>
+        <w:rPr>
+          <w:rFonts w:ascii="Times New Roman" w:hAnsi="Times New Roman" w:cs="Times New Roman"/>
+          <w:lang w:val="es-GT"/>
+        </w:rPr>
+        <w:tab/>
+        <w:t>3.2.1) Configuración por archivo</w:t>
+      </w:r>
+    </w:p>
+    <w:p>
+      <w:pPr>
+        <w:rPr>
+          <w:rFonts w:ascii="Times New Roman" w:hAnsi="Times New Roman" w:cs="Times New Roman"/>
+          <w:lang w:val="es-GT"/>
+        </w:rPr>
+      </w:pPr>
+      <w:r>
+        <w:rPr>
+          <w:rFonts w:ascii="Times New Roman" w:hAnsi="Times New Roman" w:cs="Times New Roman"/>
+          <w:lang w:val="es-GT"/>
+        </w:rPr>
+        <w:t xml:space="preserve">El simulador se diseñó para cargar la Máquina de Turing desde un archivo de configuración en formato JSON. Para este proyecto, la máquina que calcula Fibonacci se define en </w:t>
+      </w:r>
+      <w:proofErr w:type="spellStart"/>
+      <w:r>
+        <w:rPr>
+          <w:rFonts w:ascii="Times New Roman" w:hAnsi="Times New Roman" w:cs="Times New Roman"/>
+          <w:lang w:val="es-GT"/>
+        </w:rPr>
+        <w:t>configuracion</w:t>
+      </w:r>
+      <w:proofErr w:type="spellEnd"/>
+      <w:r>
+        <w:rPr>
+          <w:rFonts w:ascii="Times New Roman" w:hAnsi="Times New Roman" w:cs="Times New Roman"/>
+          <w:lang w:val="es-GT"/>
+        </w:rPr>
+        <w:t>/</w:t>
+      </w:r>
+      <w:proofErr w:type="spellStart"/>
+      <w:r>
+        <w:rPr>
+          <w:rFonts w:ascii="Times New Roman" w:hAnsi="Times New Roman" w:cs="Times New Roman"/>
+          <w:lang w:val="es-GT"/>
+        </w:rPr>
+        <w:t>fibonacci.json</w:t>
+      </w:r>
+      <w:proofErr w:type="spellEnd"/>
+      <w:r>
+        <w:rPr>
+          <w:rFonts w:ascii="Times New Roman" w:hAnsi="Times New Roman" w:cs="Times New Roman"/>
+          <w:lang w:val="es-GT"/>
+        </w:rPr>
+        <w:t xml:space="preserve">. El simulador utiliza los campos </w:t>
+      </w:r>
+      <w:proofErr w:type="spellStart"/>
+      <w:r>
+        <w:rPr>
+          <w:rFonts w:ascii="Times New Roman" w:hAnsi="Times New Roman" w:cs="Times New Roman"/>
+          <w:lang w:val="es-GT"/>
+        </w:rPr>
+        <w:t>states</w:t>
+      </w:r>
+      <w:proofErr w:type="spellEnd"/>
+      <w:r>
+        <w:rPr>
+          <w:rFonts w:ascii="Times New Roman" w:hAnsi="Times New Roman" w:cs="Times New Roman"/>
+          <w:lang w:val="es-GT"/>
+        </w:rPr>
+        <w:t xml:space="preserve">, </w:t>
+      </w:r>
+      <w:proofErr w:type="spellStart"/>
+      <w:r>
+        <w:rPr>
+          <w:rFonts w:ascii="Times New Roman" w:hAnsi="Times New Roman" w:cs="Times New Roman"/>
+          <w:lang w:val="es-GT"/>
+        </w:rPr>
+        <w:t>input_alphabet</w:t>
+      </w:r>
+      <w:proofErr w:type="spellEnd"/>
+      <w:r>
+        <w:rPr>
+          <w:rFonts w:ascii="Times New Roman" w:hAnsi="Times New Roman" w:cs="Times New Roman"/>
+          <w:lang w:val="es-GT"/>
+        </w:rPr>
+        <w:t xml:space="preserve">, </w:t>
+      </w:r>
+      <w:proofErr w:type="spellStart"/>
+      <w:r>
+        <w:rPr>
+          <w:rFonts w:ascii="Times New Roman" w:hAnsi="Times New Roman" w:cs="Times New Roman"/>
+          <w:lang w:val="es-GT"/>
+        </w:rPr>
+        <w:t>tape_alphabet</w:t>
+      </w:r>
+      <w:proofErr w:type="spellEnd"/>
+      <w:r>
+        <w:rPr>
+          <w:rFonts w:ascii="Times New Roman" w:hAnsi="Times New Roman" w:cs="Times New Roman"/>
+          <w:lang w:val="es-GT"/>
+        </w:rPr>
+        <w:t xml:space="preserve">, </w:t>
+      </w:r>
+      <w:proofErr w:type="spellStart"/>
+      <w:r>
+        <w:rPr>
+          <w:rFonts w:ascii="Times New Roman" w:hAnsi="Times New Roman" w:cs="Times New Roman"/>
+          <w:lang w:val="es-GT"/>
+        </w:rPr>
+        <w:t>initial_state</w:t>
+      </w:r>
+      <w:proofErr w:type="spellEnd"/>
+      <w:r>
+        <w:rPr>
+          <w:rFonts w:ascii="Times New Roman" w:hAnsi="Times New Roman" w:cs="Times New Roman"/>
+          <w:lang w:val="es-GT"/>
+        </w:rPr>
+        <w:t xml:space="preserve">, </w:t>
+      </w:r>
+      <w:proofErr w:type="spellStart"/>
+      <w:r>
+        <w:rPr>
+          <w:rFonts w:ascii="Times New Roman" w:hAnsi="Times New Roman" w:cs="Times New Roman"/>
+          <w:lang w:val="es-GT"/>
+        </w:rPr>
+        <w:t>accept_states</w:t>
+      </w:r>
+      <w:proofErr w:type="spellEnd"/>
+      <w:r>
+        <w:rPr>
+          <w:rFonts w:ascii="Times New Roman" w:hAnsi="Times New Roman" w:cs="Times New Roman"/>
+          <w:lang w:val="es-GT"/>
+        </w:rPr>
+        <w:t xml:space="preserve">, </w:t>
+      </w:r>
+      <w:proofErr w:type="spellStart"/>
+      <w:r>
+        <w:rPr>
+          <w:rFonts w:ascii="Times New Roman" w:hAnsi="Times New Roman" w:cs="Times New Roman"/>
+          <w:lang w:val="es-GT"/>
+        </w:rPr>
+        <w:t>blank_symbol</w:t>
+      </w:r>
+      <w:proofErr w:type="spellEnd"/>
+      <w:r>
+        <w:rPr>
+          <w:rFonts w:ascii="Times New Roman" w:hAnsi="Times New Roman" w:cs="Times New Roman"/>
+          <w:lang w:val="es-GT"/>
+        </w:rPr>
+        <w:t xml:space="preserve"> y </w:t>
+      </w:r>
+      <w:proofErr w:type="spellStart"/>
+      <w:r>
+        <w:rPr>
+          <w:rFonts w:ascii="Times New Roman" w:hAnsi="Times New Roman" w:cs="Times New Roman"/>
+          <w:lang w:val="es-GT"/>
+        </w:rPr>
+        <w:t>transitions</w:t>
+      </w:r>
+      <w:proofErr w:type="spellEnd"/>
+      <w:r>
+        <w:rPr>
+          <w:rFonts w:ascii="Times New Roman" w:hAnsi="Times New Roman" w:cs="Times New Roman"/>
+          <w:lang w:val="es-GT"/>
+        </w:rPr>
+        <w:t xml:space="preserve"> para construir internamente la tabla de transición y ejecutar la simulación paso a paso. En la configuración de Fibonacci, el estado inicial es q0, el estado de aceptación es </w:t>
+      </w:r>
+      <w:proofErr w:type="spellStart"/>
+      <w:r>
+        <w:rPr>
+          <w:rFonts w:ascii="Times New Roman" w:hAnsi="Times New Roman" w:cs="Times New Roman"/>
+          <w:lang w:val="es-GT"/>
+        </w:rPr>
+        <w:t>q_aceptar</w:t>
+      </w:r>
+      <w:proofErr w:type="spellEnd"/>
+      <w:r>
+        <w:rPr>
+          <w:rFonts w:ascii="Times New Roman" w:hAnsi="Times New Roman" w:cs="Times New Roman"/>
+          <w:lang w:val="es-GT"/>
+        </w:rPr>
+        <w:t>, el símbolo blanco es B, el alfabeto de entrada es ["1"], el alfabeto de cinta es ["1","0","X","B"], y la máquina contiene 389 estados con 402 transiciones.</w:t>
+      </w:r>
+    </w:p>
+    <w:p>
+      <w:pPr>
+        <w:rPr>
+          <w:rFonts w:ascii="Times New Roman" w:hAnsi="Times New Roman" w:cs="Times New Roman"/>
+          <w:lang w:val="es-GT"/>
+        </w:rPr>
+      </w:pPr>
+      <w:r>
+        <w:rPr>
+          <w:rFonts w:ascii="Times New Roman" w:hAnsi="Times New Roman" w:cs="Times New Roman"/>
+          <w:lang w:val="es-GT"/>
+        </w:rPr>
+        <w:lastRenderedPageBreak/>
+        <w:t>Además, el programa permite ejecutar otras Máquinas de Turing definidas con el mismo formato: mediante la opción 3 del menú se ingresa la ruta a cualquier JSON compatible, sin necesidad de modificar el código.</w:t>
+      </w:r>
+    </w:p>
+    <w:p>
+      <w:pPr>
+        <w:rPr>
+          <w:rFonts w:ascii="Times New Roman" w:hAnsi="Times New Roman" w:cs="Times New Roman"/>
+          <w:lang w:val="es-GT"/>
+        </w:rPr>
+      </w:pPr>
+    </w:p>
+    <w:p>
+      <w:pPr>
+        <w:pStyle w:val="Heading2"/>
+        <w:ind w:firstLine="720"/>
+        <w:rPr>
+          <w:lang w:val="es-GT"/>
+        </w:rPr>
+      </w:pPr>
+      <w:r>
+        <w:rPr>
+          <w:lang w:val="es-GT"/>
+        </w:rPr>
+        <w:t>3.2.2)</w:t>
+      </w:r>
+      <w:r>
+        <w:rPr>
+          <w:lang w:val="es-GT"/>
+        </w:rPr>
+        <w:tab/>
+        <w:t>Ingreso de la cadena de entrada</w:t>
+      </w:r>
+    </w:p>
+    <w:p>
+      <w:pPr>
+        <w:rPr>
+          <w:lang w:val="es-GT"/>
+        </w:rPr>
+      </w:pPr>
+      <w:r>
+        <w:rPr>
+          <w:lang w:val="es-GT"/>
+        </w:rPr>
+        <w:t>La ejecución se realiza por medio de un menú interactivo. Para Fibonacci (opción 1), el usuario ingresa directamente el valor n en el rango 0–12 y el programa construye la cadena de entrada en representación unaria:</w:t>
+      </w:r>
+    </w:p>
+    <w:p>
+      <w:pPr>
+        <w:numPr>
+          <w:ilvl w:val="0"/>
+          <w:numId w:val="20"/>
+        </w:numPr>
+        <w:rPr>
+          <w:lang w:val="es-GT"/>
+        </w:rPr>
+      </w:pPr>
+      <w:r>
+        <w:rPr>
+          <w:lang w:val="es-GT"/>
+        </w:rPr>
+        <w:t xml:space="preserve">Para n=0, la cadena utilizada es la </w:t>
+      </w:r>
+      <w:r>
+        <w:rPr>
+          <w:b/>
+          <w:bCs/>
+          <w:lang w:val="es-GT"/>
+        </w:rPr>
+        <w:t>cadena vacía</w:t>
+      </w:r>
+      <w:r>
+        <w:rPr>
+          <w:lang w:val="es-GT"/>
+        </w:rPr>
+        <w:t xml:space="preserve"> ''.</w:t>
+      </w:r>
+    </w:p>
+    <w:p>
+      <w:pPr>
+        <w:numPr>
+          <w:ilvl w:val="0"/>
+          <w:numId w:val="20"/>
+        </w:numPr>
+        <w:rPr>
+          <w:lang w:val="es-GT"/>
+        </w:rPr>
+      </w:pPr>
+      <w:r>
+        <w:rPr>
+          <w:lang w:val="es-GT"/>
+        </w:rPr>
+        <w:t>Para n=3, la cadena utilizada es '111'.</w:t>
+      </w:r>
+    </w:p>
+    <w:p>
+      <w:pPr>
+        <w:numPr>
+          <w:ilvl w:val="0"/>
+          <w:numId w:val="20"/>
+        </w:numPr>
+        <w:rPr>
+          <w:lang w:val="es-GT"/>
+        </w:rPr>
+      </w:pPr>
+      <w:r>
+        <w:rPr>
+          <w:lang w:val="es-GT"/>
+        </w:rPr>
+        <w:t>Para n=5, la cadena utilizada es '11111'.</w:t>
+      </w:r>
+    </w:p>
+    <w:p>
+      <w:pPr>
+        <w:rPr>
+          <w:lang w:val="es-GT"/>
+        </w:rPr>
+      </w:pPr>
+      <w:r>
+        <w:rPr>
+          <w:lang w:val="es-GT"/>
+        </w:rPr>
+        <w:t>Para probar entradas manuales y/o usar otras máquinas, la opción 3 del menú solicita: ruta al JSON de la máquina, cadena de entrada, máximo de pasos y si se desea mostrar la traza. En este modo, por ejemplo, un negativo puede representarse como -111 (para -3). Si la entrada contiene símbolos fuera del alfabeto o la máquina no tiene una transición aplicable desde la configuración actual, la simulación se detiene sin aceptar e imprime el mensaje: &gt;&gt; Detenida: no hay transición aplicable.</w:t>
+      </w:r>
+    </w:p>
+    <w:p>
+      <w:pPr>
+        <w:pStyle w:val="Heading2"/>
+        <w:rPr>
+          <w:lang w:val="es-GT"/>
+        </w:rPr>
+      </w:pPr>
+      <w:r>
+        <w:rPr>
+          <w:lang w:val="es-GT"/>
+        </w:rPr>
+        <w:t>3.2</w:t>
+      </w:r>
+      <w:r>
+        <w:rPr>
+          <w:lang w:val="es-GT"/>
+        </w:rPr>
+        <w:t>.3 Listado de configuraciones (traza de la simulación)</w:t>
+      </w:r>
+    </w:p>
+    <w:p>
+      <w:pPr>
+        <w:rPr>
+          <w:lang w:val="es-GT"/>
+        </w:rPr>
+      </w:pPr>
+      <w:r>
+        <w:rPr>
+          <w:lang w:val="es-GT"/>
+        </w:rPr>
+        <w:t>Durante la simulación, el programa puede mostrar la traza completa de configuraciones, indicando en cada paso: el estado actual, la posición de la cabeza y el contenido visible de la cinta. Esto permite verificar de forma directa que la ejecución coincide con la tabla de transiciones definida en el JSON.</w:t>
+      </w:r>
+    </w:p>
+    <w:p>
+      <w:pPr>
+        <w:rPr>
+          <w:lang w:val="es-GT"/>
+        </w:rPr>
+      </w:pPr>
+      <w:r>
+        <w:rPr>
+          <w:lang w:val="es-GT"/>
+        </w:rPr>
+        <w:t>A continuación se muestra un ejemplo real de ejecución con n=5 (modo Fibonacci con traza habilitada):</w:t>
+      </w:r>
+    </w:p>
+    <w:p>
+      <w:pPr>
+        <w:rPr>
+          <w:lang w:val="es-GT"/>
+        </w:rPr>
+      </w:pPr>
+      <w:r>
+        <w:rPr>
+          <w:lang w:val="es-GT"/>
+        </w:rPr>
+        <w:drawing>
+          <wp:inline distT="0" distB="0" distL="0" distR="0" wp14:anchorId="3CF39A0C" wp14:editId="036B5E89">
+            <wp:extent cx="3343042" cy="1951269"/>
+            <wp:effectExtent l="0" t="0" r="0" b="0"/>
+            <wp:docPr id="2116363433" name="Picture 1"/>
+            <wp:cNvGraphicFramePr>
+              <a:graphicFrameLocks xmlns:a="http://schemas.openxmlformats.org/drawingml/2006/main" noChangeAspect="1"/>
+            </wp:cNvGraphicFramePr>
+            <a:graphic xmlns:a="http://schemas.openxmlformats.org/drawingml/2006/main">
+              <a:graphicData uri="http://schemas.openxmlformats.org/drawingml/2006/picture">
+                <pic:pic xmlns:pic="http://schemas.openxmlformats.org/drawingml/2006/picture">
+                  <pic:nvPicPr>
+                    <pic:cNvPr id="2116363433" name=""/>
+                    <pic:cNvPicPr/>
+                  </pic:nvPicPr>
+                  <pic:blipFill>
+                    <a:blip r:embed="rId10"/>
+                    <a:stretch>
+                      <a:fillRect/>
+                    </a:stretch>
+                  </pic:blipFill>
+                  <pic:spPr>
+                    <a:xfrm>
+                      <a:off x="0" y="0"/>
+                      <a:ext cx="3353588" cy="1957425"/>
+                    </a:xfrm>
+                    <a:prstGeom prst="rect">
+                      <a:avLst/>
+                    </a:prstGeom>
+                  </pic:spPr>
+                </pic:pic>
+              </a:graphicData>
+            </a:graphic>
+          </wp:inline>
+        </w:drawing>
+      </w:r>
+    </w:p>
+    <w:p>
+      <w:pPr>
+        <w:pStyle w:val="Heading2"/>
+        <w:rPr>
+          <w:lang w:val="es-GT"/>
+        </w:rPr>
+      </w:pPr>
+      <w:r>
+        <w:rPr>
+          <w:lang w:val="es-GT"/>
+        </w:rPr>
+        <w:lastRenderedPageBreak/>
+        <w:t>3.2.4</w:t>
+      </w:r>
+      <w:r>
+        <w:rPr>
+          <w:lang w:val="es-GT"/>
+        </w:rPr>
+        <w:t xml:space="preserve"> Ejecución del programa</w:t>
+      </w:r>
+    </w:p>
+    <w:p>
+      <w:pPr>
+        <w:rPr>
+          <w:lang w:val="es-GT"/>
+        </w:rPr>
+      </w:pPr>
+      <w:r>
+        <w:rPr>
+          <w:lang w:val="es-GT"/>
+        </w:rPr>
+        <w:t>El script principal del proyecto es main.py y se ejecuta desde la raíz del repositorio con:</w:t>
+      </w:r>
+    </w:p>
+    <w:p>
+      <w:pPr>
+        <w:numPr>
+          <w:ilvl w:val="0"/>
+          <w:numId w:val="21"/>
+        </w:numPr>
+        <w:rPr>
+          <w:lang w:val="es-GT"/>
+        </w:rPr>
+      </w:pPr>
+      <w:r>
+        <w:rPr>
+          <w:lang w:val="es-GT"/>
+        </w:rPr>
+        <w:t xml:space="preserve">python3 main.py (o </w:t>
+      </w:r>
+      <w:proofErr w:type="spellStart"/>
+      <w:r>
+        <w:rPr>
+          <w:lang w:val="es-GT"/>
+        </w:rPr>
+        <w:t>python</w:t>
+      </w:r>
+      <w:proofErr w:type="spellEnd"/>
+      <w:r>
+        <w:rPr>
+          <w:lang w:val="es-GT"/>
+        </w:rPr>
+        <w:t xml:space="preserve"> main.py según el entorno)</w:t>
+      </w:r>
+    </w:p>
+    <w:p>
+      <w:pPr>
+        <w:rPr>
+          <w:lang w:val="es-GT"/>
+        </w:rPr>
+      </w:pPr>
+      <w:r>
+        <w:rPr>
+          <w:lang w:val="es-GT"/>
+        </w:rPr>
+        <w:t xml:space="preserve">El proyecto declara Python 3.8+ y dependencias instalables con </w:t>
+      </w:r>
+      <w:proofErr w:type="spellStart"/>
+      <w:r>
+        <w:rPr>
+          <w:lang w:val="es-GT"/>
+        </w:rPr>
+        <w:t>pip</w:t>
+      </w:r>
+      <w:proofErr w:type="spellEnd"/>
+      <w:r>
+        <w:rPr>
+          <w:lang w:val="es-GT"/>
+        </w:rPr>
+        <w:t xml:space="preserve"> </w:t>
+      </w:r>
+      <w:proofErr w:type="spellStart"/>
+      <w:r>
+        <w:rPr>
+          <w:lang w:val="es-GT"/>
+        </w:rPr>
+        <w:t>install</w:t>
+      </w:r>
+      <w:proofErr w:type="spellEnd"/>
+      <w:r>
+        <w:rPr>
+          <w:lang w:val="es-GT"/>
+        </w:rPr>
+        <w:t xml:space="preserve"> -r requirements.txt. El programa no utiliza argumentos por línea de comandos; toda la interacción se realiza mediante menú. En particular, la opción 3 permite especificar: ruta al archivo JSON de la máquina, cadena de entrada, máximo de pasos (por defecto 10000) y si se desea mostrar la traza.</w:t>
+      </w:r>
+    </w:p>
+    <w:p>
+      <w:pPr>
+        <w:rPr>
+          <w:lang w:val="es-GT"/>
+        </w:rPr>
+      </w:pPr>
+    </w:p>
+    <w:p>
+      <w:pPr>
+        <w:rPr>
+          <w:lang w:val="es-GT"/>
+        </w:rPr>
+      </w:pPr>
+      <w:r>
+        <w:rPr>
+          <w:lang w:val="es-GT"/>
+        </w:rPr>
+        <w:t xml:space="preserve"> </w:t>
+      </w:r>
+      <w:r>
+        <w:rPr>
           <w:lang w:val="es-GT"/>
         </w:rPr>
         <w:br w:type="page"/>
@@ -13413,7 +13428,25 @@
           <w:sz w:val="24"/>
           <w:szCs w:val="24"/>
         </w:rPr>
-        <w:t>4.1 Grafico de dispersion</w:t>
+        <w:t xml:space="preserve">4.1 </w:t>
+      </w:r>
+      <w:proofErr w:type="spellStart"/>
+      <w:r>
+        <w:rPr>
+          <w:rFonts w:ascii="Times New Roman" w:hAnsi="Times New Roman" w:cs="Times New Roman"/>
+          <w:sz w:val="24"/>
+          <w:szCs w:val="24"/>
+        </w:rPr>
+        <w:t>Grafico</w:t>
+      </w:r>
+      <w:proofErr w:type="spellEnd"/>
+      <w:r>
+        <w:rPr>
+          <w:rFonts w:ascii="Times New Roman" w:hAnsi="Times New Roman" w:cs="Times New Roman"/>
+          <w:sz w:val="24"/>
+          <w:szCs w:val="24"/>
+        </w:rPr>
+        <w:t xml:space="preserve"> de dispersion</w:t>
       </w:r>
     </w:p>
     <w:p>
@@ -13567,7 +13600,7 @@
                     <pic:cNvPicPr/>
                   </pic:nvPicPr>
                   <pic:blipFill>
-                    <a:blip r:embed="rId10"/>
+                    <a:blip r:embed="rId11"/>
                     <a:stretch>
                       <a:fillRect/>
                     </a:stretch>
@@ -13778,17 +13811,17 @@
           <w:lang w:val="es-GT"/>
         </w:rPr>
       </w:pPr>
-      <w:proofErr w:type="spellStart"/>
       <w:r>
         <w:rPr>
           <w:rFonts w:ascii="Times New Roman" w:hAnsi="Times New Roman" w:cs="Times New Roman"/>
-          <w:sz w:val="24"/>
-          <w:szCs w:val="24"/>
-          <w:lang w:val="es-GT"/>
-        </w:rPr>
-        <w:t>Justificacion</w:t>
+          <w:b/>
+          <w:bCs/>
+          <w:sz w:val="24"/>
+          <w:szCs w:val="24"/>
+          <w:lang w:val="es-GT"/>
+        </w:rPr>
+        <w:t>Justificación:</w:t>
       </w:r>
-      <w:proofErr w:type="spellEnd"/>
       <w:r>
         <w:rPr>
           <w:rFonts w:ascii="Times New Roman" w:hAnsi="Times New Roman" w:cs="Times New Roman"/>
@@ -13796,19 +13829,19 @@
           <w:szCs w:val="24"/>
           <w:lang w:val="es-GT"/>
         </w:rPr>
-        <w:t xml:space="preserve">: la </w:t>
+        <w:t xml:space="preserve"> La regresión polinomial de grado 2 se ajusta adecuadamente a los datos experimentales medidos para el rango de entradas evaluado (n=0..12). El término cuadrático es el dominante en el modelo, lo que coincide con el crecimiento observado en el número de pasos y el tiempo conforme aumenta el tamaño de la entrada. Por ello, el comportamiento reportado como </w:t>
       </w:r>
-      <w:proofErr w:type="spellStart"/>
       <w:r>
         <w:rPr>
           <w:rFonts w:ascii="Times New Roman" w:hAnsi="Times New Roman" w:cs="Times New Roman"/>
-          <w:sz w:val="24"/>
-          <w:szCs w:val="24"/>
-          <w:lang w:val="es-GT"/>
-        </w:rPr>
-        <w:t>regresion</w:t>
+          <w:b/>
+          <w:bCs/>
+          <w:sz w:val="24"/>
+          <w:szCs w:val="24"/>
+          <w:lang w:val="es-GT"/>
+        </w:rPr>
+        <w:t>O(n²)</w:t>
       </w:r>
-      <w:proofErr w:type="spellEnd"/>
       <w:r>
         <w:rPr>
           <w:rFonts w:ascii="Times New Roman" w:hAnsi="Times New Roman" w:cs="Times New Roman"/>
@@ -13816,19 +13849,19 @@
           <w:szCs w:val="24"/>
           <w:lang w:val="es-GT"/>
         </w:rPr>
-        <w:t xml:space="preserve"> polinomial de grado 2 se ajusta adecuadamente a los datos experimentales. El coeficiente del </w:t>
+        <w:t xml:space="preserve"> se presenta como una conclusión </w:t>
       </w:r>
-      <w:proofErr w:type="spellStart"/>
       <w:r>
         <w:rPr>
           <w:rFonts w:ascii="Times New Roman" w:hAnsi="Times New Roman" w:cs="Times New Roman"/>
-          <w:sz w:val="24"/>
-          <w:szCs w:val="24"/>
-          <w:lang w:val="es-GT"/>
-        </w:rPr>
-        <w:t>termino</w:t>
+          <w:b/>
+          <w:bCs/>
+          <w:sz w:val="24"/>
+          <w:szCs w:val="24"/>
+          <w:lang w:val="es-GT"/>
+        </w:rPr>
+        <w:t>empírica</w:t>
       </w:r>
-      <w:proofErr w:type="spellEnd"/>
       <w:r>
         <w:rPr>
           <w:rFonts w:ascii="Times New Roman" w:hAnsi="Times New Roman" w:cs="Times New Roman"/>
@@ -13836,147 +13869,7 @@
           <w:szCs w:val="24"/>
           <w:lang w:val="es-GT"/>
         </w:rPr>
-        <w:t xml:space="preserve"> </w:t>
-      </w:r>
-      <w:proofErr w:type="spellStart"/>
-      <w:r>
-        <w:rPr>
-          <w:rFonts w:ascii="Times New Roman" w:hAnsi="Times New Roman" w:cs="Times New Roman"/>
-          <w:sz w:val="24"/>
-          <w:szCs w:val="24"/>
-          <w:lang w:val="es-GT"/>
-        </w:rPr>
-        <w:t>cuadratico</w:t>
-      </w:r>
-      <w:proofErr w:type="spellEnd"/>
-      <w:r>
-        <w:rPr>
-          <w:rFonts w:ascii="Times New Roman" w:hAnsi="Times New Roman" w:cs="Times New Roman"/>
-          <w:sz w:val="24"/>
-          <w:szCs w:val="24"/>
-          <w:lang w:val="es-GT"/>
-        </w:rPr>
-        <w:t xml:space="preserve"> es positivo y dominante, confirmando que el </w:t>
-      </w:r>
-      <w:proofErr w:type="spellStart"/>
-      <w:r>
-        <w:rPr>
-          <w:rFonts w:ascii="Times New Roman" w:hAnsi="Times New Roman" w:cs="Times New Roman"/>
-          <w:sz w:val="24"/>
-          <w:szCs w:val="24"/>
-          <w:lang w:val="es-GT"/>
-        </w:rPr>
-        <w:t>numero</w:t>
-      </w:r>
-      <w:proofErr w:type="spellEnd"/>
-      <w:r>
-        <w:rPr>
-          <w:rFonts w:ascii="Times New Roman" w:hAnsi="Times New Roman" w:cs="Times New Roman"/>
-          <w:sz w:val="24"/>
-          <w:szCs w:val="24"/>
-          <w:lang w:val="es-GT"/>
-        </w:rPr>
-        <w:t xml:space="preserve"> de pasos crece </w:t>
-      </w:r>
-      <w:proofErr w:type="spellStart"/>
-      <w:r>
-        <w:rPr>
-          <w:rFonts w:ascii="Times New Roman" w:hAnsi="Times New Roman" w:cs="Times New Roman"/>
-          <w:sz w:val="24"/>
-          <w:szCs w:val="24"/>
-          <w:lang w:val="es-GT"/>
-        </w:rPr>
-        <w:t>cuadraticamente</w:t>
-      </w:r>
-      <w:proofErr w:type="spellEnd"/>
-      <w:r>
-        <w:rPr>
-          <w:rFonts w:ascii="Times New Roman" w:hAnsi="Times New Roman" w:cs="Times New Roman"/>
-          <w:sz w:val="24"/>
-          <w:szCs w:val="24"/>
-          <w:lang w:val="es-GT"/>
-        </w:rPr>
-        <w:t xml:space="preserve"> respecto al </w:t>
-      </w:r>
-      <w:proofErr w:type="spellStart"/>
-      <w:r>
-        <w:rPr>
-          <w:rFonts w:ascii="Times New Roman" w:hAnsi="Times New Roman" w:cs="Times New Roman"/>
-          <w:sz w:val="24"/>
-          <w:szCs w:val="24"/>
-          <w:lang w:val="es-GT"/>
-        </w:rPr>
-        <w:t>tamano</w:t>
-      </w:r>
-      <w:proofErr w:type="spellEnd"/>
-      <w:r>
-        <w:rPr>
-          <w:rFonts w:ascii="Times New Roman" w:hAnsi="Times New Roman" w:cs="Times New Roman"/>
-          <w:sz w:val="24"/>
-          <w:szCs w:val="24"/>
-          <w:lang w:val="es-GT"/>
-        </w:rPr>
-        <w:t xml:space="preserve"> de entrada n. Esto se debe a </w:t>
-      </w:r>
-      <w:proofErr w:type="gramStart"/>
-      <w:r>
-        <w:rPr>
-          <w:rFonts w:ascii="Times New Roman" w:hAnsi="Times New Roman" w:cs="Times New Roman"/>
-          <w:sz w:val="24"/>
-          <w:szCs w:val="24"/>
-          <w:lang w:val="es-GT"/>
-        </w:rPr>
-        <w:t>que</w:t>
-      </w:r>
-      <w:proofErr w:type="gramEnd"/>
-      <w:r>
-        <w:rPr>
-          <w:rFonts w:ascii="Times New Roman" w:hAnsi="Times New Roman" w:cs="Times New Roman"/>
-          <w:sz w:val="24"/>
-          <w:szCs w:val="24"/>
-          <w:lang w:val="es-GT"/>
-        </w:rPr>
-        <w:t xml:space="preserve"> para cada valor de n, la MT debe recorrer la entrada (n pasos de lectura) y luego escribir F(n) unos en la salida, donde F(n) crece </w:t>
-      </w:r>
-      <w:proofErr w:type="gramStart"/>
-      <w:r>
-        <w:rPr>
-          <w:rFonts w:ascii="Times New Roman" w:hAnsi="Times New Roman" w:cs="Times New Roman"/>
-          <w:sz w:val="24"/>
-          <w:szCs w:val="24"/>
-          <w:lang w:val="es-GT"/>
-        </w:rPr>
-        <w:t>exponencialmente</w:t>
-      </w:r>
-      <w:proofErr w:type="gramEnd"/>
-      <w:r>
-        <w:rPr>
-          <w:rFonts w:ascii="Times New Roman" w:hAnsi="Times New Roman" w:cs="Times New Roman"/>
-          <w:sz w:val="24"/>
-          <w:szCs w:val="24"/>
-          <w:lang w:val="es-GT"/>
-        </w:rPr>
-        <w:t xml:space="preserve"> pero la </w:t>
-      </w:r>
-      <w:proofErr w:type="spellStart"/>
-      <w:r>
-        <w:rPr>
-          <w:rFonts w:ascii="Times New Roman" w:hAnsi="Times New Roman" w:cs="Times New Roman"/>
-          <w:sz w:val="24"/>
-          <w:szCs w:val="24"/>
-          <w:lang w:val="es-GT"/>
-        </w:rPr>
-        <w:t>representacion</w:t>
-      </w:r>
-      <w:proofErr w:type="spellEnd"/>
-      <w:r>
-        <w:rPr>
-          <w:rFonts w:ascii="Times New Roman" w:hAnsi="Times New Roman" w:cs="Times New Roman"/>
-          <w:sz w:val="24"/>
-          <w:szCs w:val="24"/>
-          <w:lang w:val="es-GT"/>
-        </w:rPr>
-        <w:t xml:space="preserve"> unaria hace que el trabajo total sea polinomial en n.</w:t>
+        <w:t xml:space="preserve"> basada en el ajuste y en las mediciones realizadas dentro de ese rango, sin que esto constituya una demostración formal fuera de los valores probados.</w:t>
       </w:r>
     </w:p>
     <w:sectPr>
@@ -14677,6 +14570,155 @@
     </w:lvl>
   </w:abstractNum>
   <w:abstractNum w:abstractNumId="13" w15:restartNumberingAfterBreak="0">
+    <w:nsid w:val="15AA508F"/>
+    <w:multiLevelType w:val="multilevel"/>
+    <w:tmpl w:val="8F286A14"/>
+    <w:lvl w:ilvl="0">
+      <w:start w:val="1"/>
+      <w:numFmt w:val="bullet"/>
+      <w:lvlText w:val=""/>
+      <w:lvlJc w:val="left"/>
+      <w:pPr>
+        <w:tabs>
+          <w:tab w:val="num" w:pos="720"/>
+        </w:tabs>
+        <w:ind w:left="720" w:hanging="360"/>
+      </w:pPr>
+      <w:rPr>
+        <w:rFonts w:ascii="Symbol" w:hAnsi="Symbol" w:hint="default"/>
+        <w:sz w:val="20"/>
+      </w:rPr>
+    </w:lvl>
+    <w:lvl w:ilvl="1" w:tentative="1">
+      <w:start w:val="1"/>
+      <w:numFmt w:val="bullet"/>
+      <w:lvlText w:val="o"/>
+      <w:lvlJc w:val="left"/>
+      <w:pPr>
+        <w:tabs>
+          <w:tab w:val="num" w:pos="1440"/>
+        </w:tabs>
+        <w:ind w:left="1440" w:hanging="360"/>
+      </w:pPr>
+      <w:rPr>
+        <w:rFonts w:ascii="Courier New" w:hAnsi="Courier New" w:hint="default"/>
+        <w:sz w:val="20"/>
+      </w:rPr>
+    </w:lvl>
+    <w:lvl w:ilvl="2" w:tentative="1">
+      <w:start w:val="1"/>
+      <w:numFmt w:val="bullet"/>
+      <w:lvlText w:val=""/>
+      <w:lvlJc w:val="left"/>
+      <w:pPr>
+        <w:tabs>
+          <w:tab w:val="num" w:pos="2160"/>
+        </w:tabs>
+        <w:ind w:left="2160" w:hanging="360"/>
+      </w:pPr>
+      <w:rPr>
+        <w:rFonts w:ascii="Wingdings" w:hAnsi="Wingdings" w:hint="default"/>
+        <w:sz w:val="20"/>
+      </w:rPr>
+    </w:lvl>
+    <w:lvl w:ilvl="3" w:tentative="1">
+      <w:start w:val="1"/>
+      <w:numFmt w:val="bullet"/>
+      <w:lvlText w:val=""/>
+      <w:lvlJc w:val="left"/>
+      <w:pPr>
+        <w:tabs>
+          <w:tab w:val="num" w:pos="2880"/>
+        </w:tabs>
+        <w:ind w:left="2880" w:hanging="360"/>
+      </w:pPr>
+      <w:rPr>
+        <w:rFonts w:ascii="Wingdings" w:hAnsi="Wingdings" w:hint="default"/>
+        <w:sz w:val="20"/>
+      </w:rPr>
+    </w:lvl>
+    <w:lvl w:ilvl="4" w:tentative="1">
+      <w:start w:val="1"/>
+      <w:numFmt w:val="bullet"/>
+      <w:lvlText w:val=""/>
+      <w:lvlJc w:val="left"/>
+      <w:pPr>
+        <w:tabs>
+          <w:tab w:val="num" w:pos="3600"/>
+        </w:tabs>
+        <w:ind w:left="3600" w:hanging="360"/>
+      </w:pPr>
+      <w:rPr>
+        <w:rFonts w:ascii="Wingdings" w:hAnsi="Wingdings" w:hint="default"/>
+        <w:sz w:val="20"/>
+      </w:rPr>
+    </w:lvl>
+    <w:lvl w:ilvl="5" w:tentative="1">
+      <w:start w:val="1"/>
+      <w:numFmt w:val="bullet"/>
+      <w:lvlText w:val=""/>
+      <w:lvlJc w:val="left"/>
+      <w:pPr>
+        <w:tabs>
+          <w:tab w:val="num" w:pos="4320"/>
+        </w:tabs>
+        <w:ind w:left="4320" w:hanging="360"/>
+      </w:pPr>
+      <w:rPr>
+        <w:rFonts w:ascii="Wingdings" w:hAnsi="Wingdings" w:hint="default"/>
+        <w:sz w:val="20"/>
+      </w:rPr>
+    </w:lvl>
+    <w:lvl w:ilvl="6" w:tentative="1">
+      <w:start w:val="1"/>
+      <w:numFmt w:val="bullet"/>
+      <w:lvlText w:val=""/>
+      <w:lvlJc w:val="left"/>
+      <w:pPr>
+        <w:tabs>
+          <w:tab w:val="num" w:pos="5040"/>
+        </w:tabs>
+        <w:ind w:left="5040" w:hanging="360"/>
+      </w:pPr>
+      <w:rPr>
+        <w:rFonts w:ascii="Wingdings" w:hAnsi="Wingdings" w:hint="default"/>
+        <w:sz w:val="20"/>
+      </w:rPr>
+    </w:lvl>
+    <w:lvl w:ilvl="7" w:tentative="1">
+      <w:start w:val="1"/>
+      <w:numFmt w:val="bullet"/>
+      <w:lvlText w:val=""/>
+      <w:lvlJc w:val="left"/>
+      <w:pPr>
+        <w:tabs>
+          <w:tab w:val="num" w:pos="5760"/>
+        </w:tabs>
+        <w:ind w:left="5760" w:hanging="360"/>
+      </w:pPr>
+      <w:rPr>
+        <w:rFonts w:ascii="Wingdings" w:hAnsi="Wingdings" w:hint="default"/>
+        <w:sz w:val="20"/>
+      </w:rPr>
+    </w:lvl>
+    <w:lvl w:ilvl="8" w:tentative="1">
+      <w:start w:val="1"/>
+      <w:numFmt w:val="bullet"/>
+      <w:lvlText w:val=""/>
+      <w:lvlJc w:val="left"/>
+      <w:pPr>
+        <w:tabs>
+          <w:tab w:val="num" w:pos="6480"/>
+        </w:tabs>
+        <w:ind w:left="6480" w:hanging="360"/>
+      </w:pPr>
+      <w:rPr>
+        <w:rFonts w:ascii="Wingdings" w:hAnsi="Wingdings" w:hint="default"/>
+        <w:sz w:val="20"/>
+      </w:rPr>
+    </w:lvl>
+  </w:abstractNum>
+  <w:abstractNum w:abstractNumId="14" w15:restartNumberingAfterBreak="0">
     <w:nsid w:val="29706A87"/>
     <w:multiLevelType w:val="hybridMultilevel"/>
     <w:tmpl w:val="34561C76"/>
@@ -14789,7 +14831,7 @@
       </w:rPr>
     </w:lvl>
   </w:abstractNum>
-  <w:abstractNum w:abstractNumId="14" w15:restartNumberingAfterBreak="0">
+  <w:abstractNum w:abstractNumId="15" w15:restartNumberingAfterBreak="0">
     <w:nsid w:val="35CB5E0F"/>
     <w:multiLevelType w:val="multilevel"/>
     <w:tmpl w:val="5D920348"/>
@@ -14938,7 +14980,7 @@
       </w:rPr>
     </w:lvl>
   </w:abstractNum>
-  <w:abstractNum w:abstractNumId="15" w15:restartNumberingAfterBreak="0">
+  <w:abstractNum w:abstractNumId="16" w15:restartNumberingAfterBreak="0">
     <w:nsid w:val="3AA05A3A"/>
     <w:multiLevelType w:val="hybridMultilevel"/>
     <w:tmpl w:val="447A7344"/>
@@ -15027,7 +15069,7 @@
       </w:pPr>
     </w:lvl>
   </w:abstractNum>
-  <w:abstractNum w:abstractNumId="16" w15:restartNumberingAfterBreak="0">
+  <w:abstractNum w:abstractNumId="17" w15:restartNumberingAfterBreak="0">
     <w:nsid w:val="44F94813"/>
     <w:multiLevelType w:val="hybridMultilevel"/>
     <w:tmpl w:val="7CB6B686"/>
@@ -15140,7 +15182,156 @@
       </w:rPr>
     </w:lvl>
   </w:abstractNum>
-  <w:abstractNum w:abstractNumId="17" w15:restartNumberingAfterBreak="0">
+  <w:abstractNum w:abstractNumId="18" w15:restartNumberingAfterBreak="0">
+    <w:nsid w:val="48D27764"/>
+    <w:multiLevelType w:val="multilevel"/>
+    <w:tmpl w:val="1EB08714"/>
+    <w:lvl w:ilvl="0">
+      <w:start w:val="1"/>
+      <w:numFmt w:val="bullet"/>
+      <w:lvlText w:val=""/>
+      <w:lvlJc w:val="left"/>
+      <w:pPr>
+        <w:tabs>
+          <w:tab w:val="num" w:pos="720"/>
+        </w:tabs>
+        <w:ind w:left="720" w:hanging="360"/>
+      </w:pPr>
+      <w:rPr>
+        <w:rFonts w:ascii="Symbol" w:hAnsi="Symbol" w:hint="default"/>
+        <w:sz w:val="20"/>
+      </w:rPr>
+    </w:lvl>
+    <w:lvl w:ilvl="1" w:tentative="1">
+      <w:start w:val="1"/>
+      <w:numFmt w:val="bullet"/>
+      <w:lvlText w:val="o"/>
+      <w:lvlJc w:val="left"/>
+      <w:pPr>
+        <w:tabs>
+          <w:tab w:val="num" w:pos="1440"/>
+        </w:tabs>
+        <w:ind w:left="1440" w:hanging="360"/>
+      </w:pPr>
+      <w:rPr>
+        <w:rFonts w:ascii="Courier New" w:hAnsi="Courier New" w:hint="default"/>
+        <w:sz w:val="20"/>
+      </w:rPr>
+    </w:lvl>
+    <w:lvl w:ilvl="2" w:tentative="1">
+      <w:start w:val="1"/>
+      <w:numFmt w:val="bullet"/>
+      <w:lvlText w:val=""/>
+      <w:lvlJc w:val="left"/>
+      <w:pPr>
+        <w:tabs>
+          <w:tab w:val="num" w:pos="2160"/>
+        </w:tabs>
+        <w:ind w:left="2160" w:hanging="360"/>
+      </w:pPr>
+      <w:rPr>
+        <w:rFonts w:ascii="Wingdings" w:hAnsi="Wingdings" w:hint="default"/>
+        <w:sz w:val="20"/>
+      </w:rPr>
+    </w:lvl>
+    <w:lvl w:ilvl="3" w:tentative="1">
+      <w:start w:val="1"/>
+      <w:numFmt w:val="bullet"/>
+      <w:lvlText w:val=""/>
+      <w:lvlJc w:val="left"/>
+      <w:pPr>
+        <w:tabs>
+          <w:tab w:val="num" w:pos="2880"/>
+        </w:tabs>
+        <w:ind w:left="2880" w:hanging="360"/>
+      </w:pPr>
+      <w:rPr>
+        <w:rFonts w:ascii="Wingdings" w:hAnsi="Wingdings" w:hint="default"/>
+        <w:sz w:val="20"/>
+      </w:rPr>
+    </w:lvl>
+    <w:lvl w:ilvl="4" w:tentative="1">
+      <w:start w:val="1"/>
+      <w:numFmt w:val="bullet"/>
+      <w:lvlText w:val=""/>
+      <w:lvlJc w:val="left"/>
+      <w:pPr>
+        <w:tabs>
+          <w:tab w:val="num" w:pos="3600"/>
+        </w:tabs>
+        <w:ind w:left="3600" w:hanging="360"/>
+      </w:pPr>
+      <w:rPr>
+        <w:rFonts w:ascii="Wingdings" w:hAnsi="Wingdings" w:hint="default"/>
+        <w:sz w:val="20"/>
+      </w:rPr>
+    </w:lvl>
+    <w:lvl w:ilvl="5" w:tentative="1">
+      <w:start w:val="1"/>
+      <w:numFmt w:val="bullet"/>
+      <w:lvlText w:val=""/>
+      <w:lvlJc w:val="left"/>
+      <w:pPr>
+        <w:tabs>
+          <w:tab w:val="num" w:pos="4320"/>
+        </w:tabs>
+        <w:ind w:left="4320" w:hanging="360"/>
+      </w:pPr>
+      <w:rPr>
+        <w:rFonts w:ascii="Wingdings" w:hAnsi="Wingdings" w:hint="default"/>
+        <w:sz w:val="20"/>
+      </w:rPr>
+    </w:lvl>
+    <w:lvl w:ilvl="6" w:tentative="1">
+      <w:start w:val="1"/>
+      <w:numFmt w:val="bullet"/>
+      <w:lvlText w:val=""/>
+      <w:lvlJc w:val="left"/>
+      <w:pPr>
+        <w:tabs>
+          <w:tab w:val="num" w:pos="5040"/>
+        </w:tabs>
+        <w:ind w:left="5040" w:hanging="360"/>
+      </w:pPr>
+      <w:rPr>
+        <w:rFonts w:ascii="Wingdings" w:hAnsi="Wingdings" w:hint="default"/>
+        <w:sz w:val="20"/>
+      </w:rPr>
+    </w:lvl>
+    <w:lvl w:ilvl="7" w:tentative="1">
+      <w:start w:val="1"/>
+      <w:numFmt w:val="bullet"/>
+      <w:lvlText w:val=""/>
+      <w:lvlJc w:val="left"/>
+      <w:pPr>
+        <w:tabs>
+          <w:tab w:val="num" w:pos="5760"/>
+        </w:tabs>
+        <w:ind w:left="5760" w:hanging="360"/>
+      </w:pPr>
+      <w:rPr>
+        <w:rFonts w:ascii="Wingdings" w:hAnsi="Wingdings" w:hint="default"/>
+        <w:sz w:val="20"/>
+      </w:rPr>
+    </w:lvl>
+    <w:lvl w:ilvl="8" w:tentative="1">
+      <w:start w:val="1"/>
+      <w:numFmt w:val="bullet"/>
+      <w:lvlText w:val=""/>
+      <w:lvlJc w:val="left"/>
+      <w:pPr>
+        <w:tabs>
+          <w:tab w:val="num" w:pos="6480"/>
+        </w:tabs>
+        <w:ind w:left="6480" w:hanging="360"/>
+      </w:pPr>
+      <w:rPr>
+        <w:rFonts w:ascii="Wingdings" w:hAnsi="Wingdings" w:hint="default"/>
+        <w:sz w:val="20"/>
+      </w:rPr>
+    </w:lvl>
+  </w:abstractNum>
+  <w:abstractNum w:abstractNumId="19" w15:restartNumberingAfterBreak="0">
     <w:nsid w:val="491731C0"/>
     <w:multiLevelType w:val="hybridMultilevel"/>
     <w:tmpl w:val="8A5C720A"/>
@@ -15253,7 +15444,7 @@
       </w:rPr>
     </w:lvl>
   </w:abstractNum>
-  <w:abstractNum w:abstractNumId="18" w15:restartNumberingAfterBreak="0">
+  <w:abstractNum w:abstractNumId="20" w15:restartNumberingAfterBreak="0">
     <w:nsid w:val="5DD510D4"/>
     <w:multiLevelType w:val="multilevel"/>
     <w:tmpl w:val="9A58D01A"/>
@@ -15430,13 +15621,13 @@
     <w:abstractNumId w:val="0"/>
   </w:num>
   <w:num w:numId="10" w16cid:durableId="972364936">
-    <w:abstractNumId w:val="16"/>
+    <w:abstractNumId w:val="17"/>
   </w:num>
   <w:num w:numId="11" w16cid:durableId="1954557275">
-    <w:abstractNumId w:val="13"/>
+    <w:abstractNumId w:val="14"/>
   </w:num>
   <w:num w:numId="12" w16cid:durableId="270744032">
-    <w:abstractNumId w:val="18"/>
+    <w:abstractNumId w:val="20"/>
   </w:num>
   <w:num w:numId="13" w16cid:durableId="574897599">
     <w:abstractNumId w:val="11"/>
@@ -15451,13 +15642,19 @@
     <w:abstractNumId w:val="10"/>
   </w:num>
   <w:num w:numId="17" w16cid:durableId="1004626590">
+    <w:abstractNumId w:val="16"/>
+  </w:num>
+  <w:num w:numId="18" w16cid:durableId="841117634">
     <w:abstractNumId w:val="15"/>
   </w:num>
-  <w:num w:numId="18" w16cid:durableId="841117634">
-    <w:abstractNumId w:val="14"/>
+  <w:num w:numId="19" w16cid:durableId="2018191981">
+    <w:abstractNumId w:val="19"/>
   </w:num>
-  <w:num w:numId="19" w16cid:durableId="2018191981">
-    <w:abstractNumId w:val="17"/>
+  <w:num w:numId="20" w16cid:durableId="18161954">
+    <w:abstractNumId w:val="13"/>
+  </w:num>
+  <w:num w:numId="21" w16cid:durableId="1428767587">
+    <w:abstractNumId w:val="18"/>
   </w:num>
 </w:numbering>
 </file>

</xml_diff>